<commit_message>
Fix stale sample sizes in SF32/SF39/SF40 legends to match figures
Phase-7 legend sweep missed these three — they cite model-subset/scope counts,
not the pop_BC numbers grepped for. SF39 794/60/851 (was 1,016/95/1,107),
SF40 202/20/219 (was 255/30/276), SF32 54/82/136 + Panel C 50 (was 72/118/190,
66). All verified against the regenerated figure data. Docx rebuilt.

Co-Authored-By: Claude Opus 4.8 <noreply@anthropic.com>
</commit_message>
<xml_diff>
--- a/paper/nmd_supplemental_figures_sf24_sf42.docx
+++ b/paper/nmd_supplemental_figures_sf24_sf42.docx
@@ -601,7 +601,7 @@
         <w:t xml:space="preserve">SF32 | CDS and 3′UTR Length Across Isoform Classes in the GENCODE-Restricted Isoform Pairs Subset. </w:t>
       </w:r>
       <w:r>
-        <w:t xml:space="preserve">Restricted to triplets in which all three transcripts are annotated coding transcripts (n = 72 NMD+/PTC+, 118 NMD+/PTC−, 190 Control). Stop anchor: each isoform's own annotated CDS. (A) CDS length; (B) 3′UTR length from the annotated stop to transcript end; (C) 3′UTR length after walking past any premature stop to the first non-premature stop (Panel C NMD+/PTC+ n = 66; 6 comparators lack a downstream non-premature stop and are dropped). Solid black bar inside each violin, median. Two-sided Wilcoxon rank-sum: </w:t>
+        <w:t xml:space="preserve">Restricted to triplets in which all three transcripts are annotated coding transcripts (n = 54 NMD+/PTC+, 82 NMD+/PTC−, 136 Control). Stop anchor: each isoform's own annotated CDS. (A) CDS length; (B) 3′UTR length from the annotated stop to transcript end; (C) 3′UTR length after walking past any premature stop to the first non-premature stop (Panel C NMD+/PTC+ n = 50; 4 comparators lack a downstream non-premature stop and are dropped). Solid black bar inside each violin, median. Two-sided Wilcoxon rank-sum: </w:t>
       </w:r>
       <w:r>
         <w:t xml:space="preserve">*</w:t>
@@ -1117,7 +1117,7 @@
         <w:t xml:space="preserve">SF39 | Branch-Level Shapley Attributions of the Deep-Learning Model, Stratified by Isoform PTC Subclass. </w:t>
       </w:r>
       <w:r>
-        <w:t xml:space="preserve">Attributions of the model's NMD prediction across the three input branches (start codon window, stop codon window, structural features), computed for every isoform in each subclass. Subclasses: NMD+/PTC+ (n = 1,016), NMD+/PTC− (n = 95), Control (n = 1,107). Interpretability is computed on all reference AUG-traceable isoforms (not restricted to the held-out test set), so subgroup sample sizes are larger than in SF40, which reports discrimination on the held-out test subset only. (A) NMD+/PTC+. (B) NMD+/PTC−. (C) Control. Within each panel, bars are ordered structural / stop / start; the value in each bar is the mean absolute Shapley attribution at that branch; the percentage above each bar is that branch's share of the subclass total. Abbreviations. PTC, premature termination codon.</w:t>
+        <w:t xml:space="preserve">Attributions of the model's NMD prediction across the three input branches (start codon window, stop codon window, structural features), computed for every isoform in each subclass. Subclasses: NMD+/PTC+ (n = 794), NMD+/PTC− (n = 60), Control (n = 851). Interpretability is computed on all reference AUG-traceable isoforms (not restricted to the held-out test set), so subgroup sample sizes are larger than in SF40, which reports discrimination on the held-out test subset only. (A) NMD+/PTC+. (B) NMD+/PTC−. (C) Control. Within each panel, bars are ordered structural / stop / start; the value in each bar is the mean absolute Shapley attribution at that branch; the percentage above each bar is that branch's share of the subclass total. Abbreviations. PTC, premature termination codon.</w:t>
       </w:r>
     </w:p>
     <w:p>
@@ -1183,7 +1183,7 @@
         <w:t xml:space="preserve">SF40 | Deep-Learning Model Discrimination by PTC Subclass on the Held-Out Test Set. </w:t>
       </w:r>
       <w:r>
-        <w:t xml:space="preserve">Held-out test-set performance of the trained NMD predictor, stratified by the three subclasses: NMD+/PTC+ (n = 255), NMD+/PTC− (n = 30), and Control (n = 276). Subgroup sample sizes reflect held-out-test-set membership. (A) ROC curves for the two NMD-vs-Control contrasts, using the model's predicted NMD probability as the score; AUC annotated per contrast; diagonal, chance. (B) Distribution of per-isoform predicted NMD probability by subclass. Abbreviations. AUC, area under the ROC curve; PTC, premature termination codon; ROC, receiver-operating-characteristic.</w:t>
+        <w:t xml:space="preserve">Held-out test-set performance of the trained NMD predictor, stratified by the three subclasses: NMD+/PTC+ (n = 202), NMD+/PTC− (n = 20), and Control (n = 219). Subgroup sample sizes reflect held-out-test-set membership. (A) ROC curves for the two NMD-vs-Control contrasts, using the model's predicted NMD probability as the score; AUC annotated per contrast; diagonal, chance. (B) Distribution of per-isoform predicted NMD probability by subclass. Abbreviations. AUC, area under the ROC curve; PTC, premature termination codon; ROC, receiver-operating-characteristic.</w:t>
       </w:r>
     </w:p>
     <w:p>

</xml_diff>